<commit_message>
add new issue #13
</commit_message>
<xml_diff>
--- a/input/stories.docx
+++ b/input/stories.docx
@@ -296,6 +296,12 @@
         </w:tc>
       </w:tr>
     </w:tbl>
+    <w:p/>
+    <w:p/>
+    <w:p>
+      <w:bookmarkStart w:id="0" w:name="_GoBack"/>
+      <w:bookmarkEnd w:id="0"/>
+    </w:p>
     <w:p>
       <w:r>
         <w:t>2.2 Shopping</w:t>
@@ -567,6 +573,7 @@
           </w:tcPr>
           <w:p>
             <w:r>
+              <w:lastRenderedPageBreak/>
               <w:t>12</w:t>
             </w:r>
           </w:p>
@@ -595,8 +602,41 @@
             <w:r>
               <w:t xml:space="preserve">AC1; Validation needed </w:t>
             </w:r>
-            <w:bookmarkStart w:id="0" w:name="_GoBack"/>
-            <w:bookmarkEnd w:id="0"/>
+          </w:p>
+        </w:tc>
+      </w:tr>
+      <w:tr>
+        <w:tc>
+          <w:tcPr>
+            <w:tcW w:w="2880" w:type="dxa"/>
+          </w:tcPr>
+          <w:p>
+            <w:r>
+              <w:t>13</w:t>
+            </w:r>
+          </w:p>
+        </w:tc>
+        <w:tc>
+          <w:tcPr>
+            <w:tcW w:w="2880" w:type="dxa"/>
+          </w:tcPr>
+          <w:p>
+            <w:r>
+              <w:t xml:space="preserve">As a user, I want to </w:t>
+            </w:r>
+            <w:r>
+              <w:t>seek help from the FAQ section</w:t>
+            </w:r>
+          </w:p>
+        </w:tc>
+        <w:tc>
+          <w:tcPr>
+            <w:tcW w:w="2880" w:type="dxa"/>
+          </w:tcPr>
+          <w:p>
+            <w:r>
+              <w:t xml:space="preserve"> </w:t>
+            </w:r>
           </w:p>
         </w:tc>
       </w:tr>
@@ -12518,7 +12558,7 @@
 </file>
 
 <file path=customXml/itemProps1.xml><?xml version="1.0" encoding="utf-8"?>
-<ds:datastoreItem xmlns:ds="http://schemas.openxmlformats.org/officeDocument/2006/customXml" ds:itemID="{3116FE82-2497-4819-B338-7C6A6C936B08}">
+<ds:datastoreItem xmlns:ds="http://schemas.openxmlformats.org/officeDocument/2006/customXml" ds:itemID="{75DFC9F9-8F8E-4077-8544-1E4188F31AD1}">
   <ds:schemaRefs>
     <ds:schemaRef ds:uri="http://schemas.openxmlformats.org/officeDocument/2006/bibliography"/>
   </ds:schemaRefs>

</xml_diff>